<commit_message>
Update project plan to real repo layout and git workflow
Rewrite the repository-structure section of Airside Project Plan.docx and
PROJECT_PLAN.md to match the folders on disk (game/Airside,
companion/AirsideCompanion) and add a version-control and multi-tool
workflow section: git is the single source of truth, pull --rebase before
work, one owner per change, feature branches for parallel work, update
GAME.md and CHANGELOG.md per change.

Co-Authored-By: Claude Sonnet 5 <noreply@anthropic.com>
</commit_message>
<xml_diff>
--- a/docs/product/Airside Project Plan.docx
+++ b/docs/product/Airside Project Plan.docx
@@ -6074,6 +6074,15 @@
       </w:r>
     </w:p>
     <w:p>
+      <w:r>
+        <w:rPr>
+          <w:rFonts w:ascii="Aptos" w:hAnsi="Aptos"/>
+          <w:color w:val="000000"/>
+        </w:rPr>
+        <w:t xml:space="preserve">The repository is organised so that pure simulation rules, Unity presentation, the iPhone companion and the written design each have one clear home.</w:t>
+      </w:r>
+    </w:p>
+    <w:p>
       <w:pPr>
         <w:spacing w:after="0" w:line="240" w:lineRule="auto"/>
         <w:ind w:left="317"/>
@@ -6084,7 +6093,7 @@
           <w:color w:val="5C6670"/>
           <w:sz w:val="17"/>
         </w:rPr>
-        <w:t>Airside/</w:t>
+        <w:t xml:space="preserve">Airside/                        Git repository - the single source of truth</w:t>
       </w:r>
     </w:p>
     <w:p>
@@ -6098,7 +6107,7 @@
           <w:color w:val="5C6670"/>
           <w:sz w:val="17"/>
         </w:rPr>
-        <w:t xml:space="preserve">  README.md</w:t>
+        <w:t xml:space="preserve">  README.md                     Orientation and first-run steps</w:t>
       </w:r>
     </w:p>
     <w:p>
@@ -6112,7 +6121,7 @@
           <w:color w:val="5C6670"/>
           <w:sz w:val="17"/>
         </w:rPr>
-        <w:t xml:space="preserve">  GAME.md</w:t>
+        <w:t xml:space="preserve">  GAME.md                       Living status board - read before every task</w:t>
       </w:r>
     </w:p>
     <w:p>
@@ -6126,7 +6135,7 @@
           <w:color w:val="5C6670"/>
           <w:sz w:val="17"/>
         </w:rPr>
-        <w:t xml:space="preserve">  CHANGELOG.md</w:t>
+        <w:t xml:space="preserve">  CHANGELOG.md                  One line per merged change, newest first</w:t>
       </w:r>
     </w:p>
     <w:p>
@@ -6140,7 +6149,7 @@
           <w:color w:val="5C6670"/>
           <w:sz w:val="17"/>
         </w:rPr>
-        <w:t xml:space="preserve">  LICENSES.md</w:t>
+        <w:t xml:space="preserve">  LICENSES.md                   Licence status (full register in docs/data/)</w:t>
       </w:r>
     </w:p>
     <w:p>
@@ -6154,7 +6163,7 @@
           <w:color w:val="5C6670"/>
           <w:sz w:val="17"/>
         </w:rPr>
-        <w:t xml:space="preserve">  docs/</w:t>
+        <w:t xml:space="preserve">  AGENTS.md                     Shared working contract for every contributor</w:t>
       </w:r>
     </w:p>
     <w:p>
@@ -6168,7 +6177,7 @@
           <w:color w:val="5C6670"/>
           <w:sz w:val="17"/>
         </w:rPr>
-        <w:t xml:space="preserve">    product/</w:t>
+        <w:t xml:space="preserve">  CLAUDE.md                     Pointer for Claude Code</w:t>
       </w:r>
     </w:p>
     <w:p>
@@ -6182,7 +6191,7 @@
           <w:color w:val="5C6670"/>
           <w:sz w:val="17"/>
         </w:rPr>
-        <w:t xml:space="preserve">      PROJECT-PLAN.md</w:t>
+        <w:t xml:space="preserve">  .cursor/rules/airside.mdc     Pointer for Cursor</w:t>
       </w:r>
     </w:p>
     <w:p>
@@ -6196,7 +6205,7 @@
           <w:color w:val="5C6670"/>
           <w:sz w:val="17"/>
         </w:rPr>
-        <w:t xml:space="preserve">      DESIGN-PILLARS.md</w:t>
+        <w:t xml:space="preserve">  .gitattributes                Unity smart-merge and binary asset rules</w:t>
       </w:r>
     </w:p>
     <w:p>
@@ -6210,7 +6219,7 @@
           <w:color w:val="5C6670"/>
           <w:sz w:val="17"/>
         </w:rPr>
-        <w:t xml:space="preserve">      MILESTONES.md</w:t>
+        <w:t xml:space="preserve">  docs/</w:t>
       </w:r>
     </w:p>
     <w:p>
@@ -6224,7 +6233,7 @@
           <w:color w:val="5C6670"/>
           <w:sz w:val="17"/>
         </w:rPr>
-        <w:t xml:space="preserve">    design/</w:t>
+        <w:t xml:space="preserve">    product/                    Airside Project Plan.docx, PROJECT_PLAN.md</w:t>
       </w:r>
     </w:p>
     <w:p>
@@ -6238,7 +6247,7 @@
           <w:color w:val="5C6670"/>
           <w:sz w:val="17"/>
         </w:rPr>
-        <w:t xml:space="preserve">      CORE-LOOP.md</w:t>
+        <w:t xml:space="preserve">    architecture/               Technical decisions and data contracts</w:t>
       </w:r>
     </w:p>
     <w:p>
@@ -6252,7 +6261,7 @@
           <w:color w:val="5C6670"/>
           <w:sz w:val="17"/>
         </w:rPr>
-        <w:t xml:space="preserve">      SIMULATION-RULES.md</w:t>
+        <w:t xml:space="preserve">    decisions/                  Numbered decision records (0001, 0002, ...)</w:t>
       </w:r>
     </w:p>
     <w:p>
@@ -6266,7 +6275,7 @@
           <w:color w:val="5C6670"/>
           <w:sz w:val="17"/>
         </w:rPr>
-        <w:t xml:space="preserve">      ECONOMY.md</w:t>
+        <w:t xml:space="preserve">    data/                       ASSET_AND_DATA_REGISTER.md</w:t>
       </w:r>
     </w:p>
     <w:p>
@@ -6280,7 +6289,7 @@
           <w:color w:val="5C6670"/>
           <w:sz w:val="17"/>
         </w:rPr>
-        <w:t xml:space="preserve">      PROGRESSION.md</w:t>
+        <w:t xml:space="preserve">    testing/                    Acceptance checks and fixtures</w:t>
       </w:r>
     </w:p>
     <w:p>
@@ -6294,7 +6303,7 @@
           <w:color w:val="5C6670"/>
           <w:sz w:val="17"/>
         </w:rPr>
-        <w:t xml:space="preserve">      UI-FLOWS.md</w:t>
+        <w:t xml:space="preserve">  game/Airside/                 Unity 6.3 LTS macOS game - open THIS in Unity</w:t>
       </w:r>
     </w:p>
     <w:p>
@@ -6308,7 +6317,7 @@
           <w:color w:val="5C6670"/>
           <w:sz w:val="17"/>
         </w:rPr>
-        <w:t xml:space="preserve">    architecture/</w:t>
+        <w:t xml:space="preserve">    Assets/Airside/</w:t>
       </w:r>
     </w:p>
     <w:p>
@@ -6322,7 +6331,7 @@
           <w:color w:val="5C6670"/>
           <w:sz w:val="17"/>
         </w:rPr>
-        <w:t xml:space="preserve">      SYSTEM-OVERVIEW.md</w:t>
+        <w:t xml:space="preserve">      Domain/                   Pure rules: time, ids (no UnityEngine types)</w:t>
       </w:r>
     </w:p>
     <w:p>
@@ -6336,7 +6345,7 @@
           <w:color w:val="5C6670"/>
           <w:sz w:val="17"/>
         </w:rPr>
-        <w:t xml:space="preserve">      PERSISTENCE.md</w:t>
+        <w:t xml:space="preserve">      Simulation/               Deterministic simulation, injected clock</w:t>
       </w:r>
     </w:p>
     <w:p>
@@ -6350,7 +6359,7 @@
           <w:color w:val="5C6670"/>
           <w:sz w:val="17"/>
         </w:rPr>
-        <w:t xml:space="preserve">      CLOUDKIT-CONTRACT.md</w:t>
+        <w:t xml:space="preserve">      Persistence/              Save schema, load and offline catch-up</w:t>
       </w:r>
     </w:p>
     <w:p>
@@ -6364,7 +6373,7 @@
           <w:color w:val="5C6670"/>
           <w:sz w:val="17"/>
         </w:rPr>
-        <w:t xml:space="preserve">      DATA-SCHEMA.md</w:t>
+        <w:t xml:space="preserve">      Presentation/             MonoBehaviours, camera, visuals (Unity-facing)</w:t>
       </w:r>
     </w:p>
     <w:p>
@@ -6378,7 +6387,7 @@
           <w:color w:val="5C6670"/>
           <w:sz w:val="17"/>
         </w:rPr>
-        <w:t xml:space="preserve">      PERFORMANCE-BUDGETS.md</w:t>
+        <w:t xml:space="preserve">      Editor/                   Editor-only startup helpers</w:t>
       </w:r>
     </w:p>
     <w:p>
@@ -6392,7 +6401,7 @@
           <w:color w:val="5C6670"/>
           <w:sz w:val="17"/>
         </w:rPr>
-        <w:t xml:space="preserve">    decisions/</w:t>
+        <w:t xml:space="preserve">      Tests/EditMode/           Deterministic NUnit tests</w:t>
       </w:r>
     </w:p>
     <w:p>
@@ -6406,7 +6415,7 @@
           <w:color w:val="5C6670"/>
           <w:sz w:val="17"/>
         </w:rPr>
-        <w:t xml:space="preserve">      ADR-0001-unity-and-swiftui.md</w:t>
+        <w:t xml:space="preserve">      Scenes/                   AirsidePrototype.unity</w:t>
       </w:r>
     </w:p>
     <w:p>
@@ -6420,7 +6429,7 @@
           <w:color w:val="5C6670"/>
           <w:sz w:val="17"/>
         </w:rPr>
-        <w:t xml:space="preserve">    production/</w:t>
+        <w:t xml:space="preserve">    ProjectSettings/</w:t>
       </w:r>
     </w:p>
     <w:p>
@@ -6434,7 +6443,7 @@
           <w:color w:val="5C6670"/>
           <w:sz w:val="17"/>
         </w:rPr>
-        <w:t xml:space="preserve">      BACKLOG.md</w:t>
+        <w:t xml:space="preserve">  companion/AirsideCompanion/   SwiftUI iPhone companion (after save/sync stable)</w:t>
       </w:r>
     </w:p>
     <w:p>
@@ -6448,7 +6457,7 @@
           <w:color w:val="5C6670"/>
           <w:sz w:val="17"/>
         </w:rPr>
-        <w:t xml:space="preserve">      PLAYTEST-NOTES.md</w:t>
+        <w:t xml:space="preserve">  scripts/</w:t>
       </w:r>
     </w:p>
     <w:p>
@@ -6462,7 +6471,7 @@
           <w:color w:val="5C6670"/>
           <w:sz w:val="17"/>
         </w:rPr>
-        <w:t xml:space="preserve">      RELEASE-CHECKLIST.md</w:t>
+        <w:t xml:space="preserve">    test-unity.sh               Deterministic simulation checks</w:t>
       </w:r>
     </w:p>
     <w:p>
@@ -6476,7 +6485,7 @@
           <w:color w:val="5C6670"/>
           <w:sz w:val="17"/>
         </w:rPr>
-        <w:t xml:space="preserve">      DATA-ASSET-REGISTER.md</w:t>
+        <w:t xml:space="preserve">    build-mac.sh                Local macOS application build</w:t>
       </w:r>
     </w:p>
     <w:p>
@@ -6490,181 +6499,21 @@
           <w:color w:val="5C6670"/>
           <w:sz w:val="17"/>
         </w:rPr>
-        <w:t xml:space="preserve">  mac-game/</w:t>
-      </w:r>
-    </w:p>
-    <w:p>
-      <w:pPr>
-        <w:spacing w:after="0" w:line="240" w:lineRule="auto"/>
-        <w:ind w:left="317"/>
-      </w:pPr>
-      <w:r>
-        <w:rPr>
-          <w:rFonts w:ascii="Menlo" w:hAnsi="Menlo"/>
-          <w:color w:val="5C6670"/>
-          <w:sz w:val="17"/>
-        </w:rPr>
-        <w:t xml:space="preserve">    Assets/</w:t>
-      </w:r>
-    </w:p>
-    <w:p>
-      <w:pPr>
-        <w:spacing w:after="0" w:line="240" w:lineRule="auto"/>
-        <w:ind w:left="317"/>
-      </w:pPr>
-      <w:r>
-        <w:rPr>
-          <w:rFonts w:ascii="Menlo" w:hAnsi="Menlo"/>
-          <w:color w:val="5C6670"/>
-          <w:sz w:val="17"/>
-        </w:rPr>
-        <w:t xml:space="preserve">    Packages/</w:t>
-      </w:r>
-    </w:p>
-    <w:p>
-      <w:pPr>
-        <w:spacing w:after="0" w:line="240" w:lineRule="auto"/>
-        <w:ind w:left="317"/>
-      </w:pPr>
-      <w:r>
-        <w:rPr>
-          <w:rFonts w:ascii="Menlo" w:hAnsi="Menlo"/>
-          <w:color w:val="5C6670"/>
-          <w:sz w:val="17"/>
-        </w:rPr>
-        <w:t xml:space="preserve">    ProjectSettings/</w:t>
-      </w:r>
-    </w:p>
-    <w:p>
-      <w:pPr>
-        <w:spacing w:after="0" w:line="240" w:lineRule="auto"/>
-        <w:ind w:left="317"/>
-      </w:pPr>
-      <w:r>
-        <w:rPr>
-          <w:rFonts w:ascii="Menlo" w:hAnsi="Menlo"/>
-          <w:color w:val="5C6670"/>
-          <w:sz w:val="17"/>
-        </w:rPr>
-        <w:t xml:space="preserve">  iphone-companion/</w:t>
-      </w:r>
-    </w:p>
-    <w:p>
-      <w:pPr>
-        <w:spacing w:after="0" w:line="240" w:lineRule="auto"/>
-        <w:ind w:left="317"/>
-      </w:pPr>
-      <w:r>
-        <w:rPr>
-          <w:rFonts w:ascii="Menlo" w:hAnsi="Menlo"/>
-          <w:color w:val="5C6670"/>
-          <w:sz w:val="17"/>
-        </w:rPr>
-        <w:t xml:space="preserve">    AirsideCompanion.xcodeproj/</w:t>
-      </w:r>
-    </w:p>
-    <w:p>
-      <w:pPr>
-        <w:spacing w:after="0" w:line="240" w:lineRule="auto"/>
-        <w:ind w:left="317"/>
-      </w:pPr>
-      <w:r>
-        <w:rPr>
-          <w:rFonts w:ascii="Menlo" w:hAnsi="Menlo"/>
-          <w:color w:val="5C6670"/>
-          <w:sz w:val="17"/>
-        </w:rPr>
-        <w:t xml:space="preserve">    AirsideCompanion/</w:t>
-      </w:r>
-    </w:p>
-    <w:p>
-      <w:pPr>
-        <w:spacing w:after="0" w:line="240" w:lineRule="auto"/>
-        <w:ind w:left="317"/>
-      </w:pPr>
-      <w:r>
-        <w:rPr>
-          <w:rFonts w:ascii="Menlo" w:hAnsi="Menlo"/>
-          <w:color w:val="5C6670"/>
-          <w:sz w:val="17"/>
-        </w:rPr>
-        <w:t xml:space="preserve">    AirsideCompanionTests/</w:t>
-      </w:r>
-    </w:p>
-    <w:p>
-      <w:pPr>
-        <w:spacing w:after="0" w:line="240" w:lineRule="auto"/>
-        <w:ind w:left="317"/>
-      </w:pPr>
-      <w:r>
-        <w:rPr>
-          <w:rFonts w:ascii="Menlo" w:hAnsi="Menlo"/>
-          <w:color w:val="5C6670"/>
-          <w:sz w:val="17"/>
-        </w:rPr>
-        <w:t xml:space="preserve">  shared/</w:t>
-      </w:r>
-    </w:p>
-    <w:p>
-      <w:pPr>
-        <w:spacing w:after="0" w:line="240" w:lineRule="auto"/>
-        <w:ind w:left="317"/>
-      </w:pPr>
-      <w:r>
-        <w:rPr>
-          <w:rFonts w:ascii="Menlo" w:hAnsi="Menlo"/>
-          <w:color w:val="5C6670"/>
-          <w:sz w:val="17"/>
-        </w:rPr>
-        <w:t xml:space="preserve">    schemas/</w:t>
-      </w:r>
-    </w:p>
-    <w:p>
-      <w:pPr>
-        <w:spacing w:after="0" w:line="240" w:lineRule="auto"/>
-        <w:ind w:left="317"/>
-      </w:pPr>
-      <w:r>
-        <w:rPr>
-          <w:rFonts w:ascii="Menlo" w:hAnsi="Menlo"/>
-          <w:color w:val="5C6670"/>
-          <w:sz w:val="17"/>
-        </w:rPr>
-        <w:t xml:space="preserve">    fixtures/</w:t>
-      </w:r>
-    </w:p>
-    <w:p>
-      <w:pPr>
-        <w:spacing w:after="0" w:line="240" w:lineRule="auto"/>
-        <w:ind w:left="317"/>
-      </w:pPr>
-      <w:r>
-        <w:rPr>
-          <w:rFonts w:ascii="Menlo" w:hAnsi="Menlo"/>
-          <w:color w:val="5C6670"/>
-          <w:sz w:val="17"/>
-        </w:rPr>
-        <w:t xml:space="preserve">  tools/</w:t>
-      </w:r>
-    </w:p>
-    <w:p>
-      <w:pPr>
-        <w:spacing w:after="0" w:line="240" w:lineRule="auto"/>
-        <w:ind w:left="317"/>
-      </w:pPr>
-      <w:r>
-        <w:rPr>
-          <w:rFonts w:ascii="Menlo" w:hAnsi="Menlo"/>
-          <w:color w:val="5C6670"/>
-          <w:sz w:val="17"/>
-        </w:rPr>
-        <w:t xml:space="preserve">  builds/</w:t>
+        <w:t xml:space="preserve">  work/                         Local scratch and builds - git-ignored</w:t>
       </w:r>
     </w:p>
     <w:p>
       <w:pPr>
         <w:spacing w:after="60"/>
       </w:pPr>
+    </w:p>
+    <w:p>
+      <w:pPr>
+        <w:pStyle w:val="Heading2"/>
+      </w:pPr>
+      <w:r>
+        <w:t>Version control and multi-tool workflow</w:t>
+      </w:r>
     </w:p>
     <w:p>
       <w:r>
@@ -6672,8 +6521,58 @@
           <w:rFonts w:ascii="Aptos" w:hAnsi="Aptos"/>
           <w:color w:val="000000"/>
         </w:rPr>
-        <w:t>GAME.md is the short briefing read before every task. It contains the current vision, current milestone, invariants, build instructions, known issues and next approved work. Detailed documents remain in docs so GAME.md stays easy to trust.</w:t>
-      </w:r>
+        <w:t xml:space="preserve">This layout reflects the actual repository on disk. Earlier drafts referred to mac-game/ and iphone-companion/; the real folders are game/Airside/ and companion/AirsideCompanion/.</w:t>
+      </w:r>
+    </w:p>
+    <w:p>
+      <w:r>
+        <w:rPr>
+          <w:rFonts w:ascii="Aptos" w:hAnsi="Aptos"/>
+          <w:color w:val="000000"/>
+        </w:rPr>
+        <w:t xml:space="preserve">The repository is the single source of truth for implementation. It is hosted as a private GitHub repository named Airside, and every participant - Bailey, ChatGPT, Cursor, Codex and Claude - works through that remote. Work that is not committed and pushed does not exist for the other tools, so a chat transcript or a single machine's local copy is never treated as current.</w:t>
+      </w:r>
+    </w:p>
+    <w:p>
+      <w:r>
+        <w:rPr>
+          <w:rFonts w:ascii="Aptos" w:hAnsi="Aptos"/>
+          <w:color w:val="000000"/>
+        </w:rPr>
+        <w:t xml:space="preserve">Before starting a task, bring the local copy up to date with a rebasing pull. Make one narrow change tied to a single acceptance criterion, run scripts/test-unity.sh, confirm the project still compiles in Unity 6.3 LTS, then commit and push straight away. GAME.md and CHANGELOG.md are updated in the same commit as any behaviour change.</w:t>
+      </w:r>
+    </w:p>
+    <w:p>
+      <w:r>
+        <w:rPr>
+          <w:rFonts w:ascii="Aptos" w:hAnsi="Aptos"/>
+          <w:color w:val="000000"/>
+        </w:rPr>
+        <w:t xml:space="preserve">One change has one owner at a time. Parallel work uses a feature branch or a git worktree with explicit, non-overlapping file boundaries; no two tools edit the same system at once. Generated code is reviewed like human code, and no merge rests on a tool's unverified claim that a build passed.</w:t>
+      </w:r>
+    </w:p>
+    <w:p>
+      <w:r>
+        <w:rPr>
+          <w:rFonts w:ascii="Aptos" w:hAnsi="Aptos"/>
+          <w:color w:val="000000"/>
+        </w:rPr>
+        <w:t xml:space="preserve">A design change adds a dated record under docs/decisions/ describing the decision, its reason, the affected systems and any save-migration impact. New ideas go to the backlog rather than straight into the active milestone.</w:t>
+      </w:r>
+    </w:p>
+    <w:p>
+      <w:r>
+        <w:rPr>
+          <w:rFonts w:ascii="Aptos" w:hAnsi="Aptos"/>
+          <w:color w:val="000000"/>
+        </w:rPr>
+        <w:t xml:space="preserve">AGENTS.md at the repository root carries this contract in full and is the file every tool reads first, alongside GAME.md. CLAUDE.md and .cursor/rules/ redirect their tools to AGENTS.md so all three assistants follow the same rules.</w:t>
+      </w:r>
+    </w:p>
+    <w:p>
+      <w:pPr>
+        <w:spacing w:after="60"/>
+      </w:pPr>
     </w:p>
     <w:p>
       <w:pPr>

</xml_diff>

<commit_message>
Document session handoff between tools in the project plan
Co-Authored-By: Claude Sonnet 5 <noreply@anthropic.com>
</commit_message>
<xml_diff>
--- a/docs/product/Airside Project Plan.docx
+++ b/docs/product/Airside Project Plan.docx
@@ -6571,6 +6571,41 @@
     </w:p>
     <w:p>
       <w:pPr>
+        <w:pStyle w:val="Heading2"/>
+      </w:pPr>
+      <w:r>
+        <w:t>Session handoff between tools</w:t>
+      </w:r>
+    </w:p>
+    <w:p>
+      <w:r>
+        <w:rPr>
+          <w:rFonts w:ascii="Aptos" w:hAnsi="Aptos"/>
+          <w:color w:val="000000"/>
+        </w:rPr>
+        <w:t xml:space="preserve">Only project state travels between tools: the git repository and the written documents. The conversation does not. A person may reach a session limit on Claude, Cursor or ChatGPT and continue on another; the new session starts without the previous chat and rebuilds context from the repository.</w:t>
+      </w:r>
+    </w:p>
+    <w:p>
+      <w:r>
+        <w:rPr>
+          <w:rFonts w:ascii="Aptos" w:hAnsi="Aptos"/>
+          <w:color w:val="000000"/>
+        </w:rPr>
+        <w:t xml:space="preserve">Two checklists in AGENTS.md keep this reliable. At the start of a session a tool pulls with rebase, reads the "Where to resume" block at the top of GAME.md, skims the changelog and recent commits, and checks out any unfinished branch named there. At the end of a session - or before a limit cuts it off - the tool commits everything (to main if green, to a feature/&lt;name&gt; branch if not), pushes, and overwrites the "Where to resume" block with the date, its name, the branch, the exact next step, anything in progress and any open question for Bailey.</w:t>
+      </w:r>
+    </w:p>
+    <w:p>
+      <w:r>
+        <w:rPr>
+          <w:rFonts w:ascii="Aptos" w:hAnsi="Aptos"/>
+          <w:color w:val="000000"/>
+        </w:rPr>
+        <w:t xml:space="preserve">GAME.md is therefore the one document that changes continuously as development proceeds. This plan and the other design documents change only when the agreed design changes, with Bailey's sign-off.</w:t>
+      </w:r>
+    </w:p>
+    <w:p>
+      <w:pPr>
         <w:spacing w:after="60"/>
       </w:pPr>
     </w:p>

</xml_diff>